<commit_message>
Make 'Revised' date a heading in CV
Change the plain 'Revised March 2026' line in cv.md to a level-5 Markdown heading (#####) to improve formatting. Regenerated/updated the corresponding cv.pdf and updated reference.docx binary files.
</commit_message>
<xml_diff>
--- a/reference.docx
+++ b/reference.docx
@@ -848,16 +848,19 @@
     <w:uiPriority w:val="9"/>
     <w:unhideWhenUsed/>
     <w:qFormat/>
+    <w:rsid w:val="00FB46D7"/>
     <w:pPr>
       <w:keepNext/>
       <w:keepLines/>
       <w:spacing w:before="200" w:after="0"/>
+      <w:jc w:val="right"/>
       <w:outlineLvl w:val="4"/>
     </w:pPr>
     <w:rPr>
-      <w:rFonts w:asciiTheme="majorHAnsi" w:eastAsiaTheme="majorEastAsia" w:hAnsiTheme="majorHAnsi" w:cstheme="majorBidi"/>
+      <w:rFonts w:eastAsiaTheme="majorEastAsia" w:cstheme="majorBidi"/>
+      <w:i/>
       <w:iCs/>
-      <w:color w:val="4F81BD" w:themeColor="accent1"/>
+      <w:color w:val="7F7F7F" w:themeColor="text1" w:themeTint="80"/>
     </w:rPr>
   </w:style>
   <w:style w:type="paragraph" w:styleId="Heading6">

</xml_diff>

<commit_message>
Update CV and reference document
Replace cv.pdf and reference.docx with updated binary versions. This commit updates the applicant CV (cv.pdf) and the reference letter (reference.docx) to reflect content and formatting changes.
</commit_message>
<xml_diff>
--- a/reference.docx
+++ b/reference.docx
@@ -48,7 +48,10 @@
       </w:pPr>
       <w:bookmarkStart w:id="0" w:name="heading-1"/>
       <w:r>
-        <w:t xml:space="preserve"> Heading 1 </w:t>
+        <w:t xml:space="preserve"> </w:t>
+      </w:r>
+      <w:r>
+        <w:t xml:space="preserve">Heading 1 </w:t>
       </w:r>
       <w:bookmarkEnd w:id="0"/>
     </w:p>
@@ -758,12 +761,36 @@
     <w:next w:val="BodyText"/>
     <w:uiPriority w:val="9"/>
     <w:qFormat/>
-    <w:rsid w:val="003B129B"/>
+    <w:rsid w:val="0035689B"/>
     <w:pPr>
       <w:keepNext/>
       <w:keepLines/>
       <w:spacing w:before="480" w:after="0"/>
       <w:outlineLvl w:val="0"/>
+    </w:pPr>
+    <w:rPr>
+      <w:rFonts w:eastAsiaTheme="majorEastAsia" w:cs="Times New Roman (Headings CS)"/>
+      <w:b/>
+      <w:bCs/>
+      <w:caps/>
+      <w:color w:val="000000" w:themeColor="text1"/>
+      <w:sz w:val="28"/>
+      <w:szCs w:val="32"/>
+    </w:rPr>
+  </w:style>
+  <w:style w:type="paragraph" w:styleId="Heading2">
+    <w:name w:val="heading 2"/>
+    <w:basedOn w:val="Normal"/>
+    <w:next w:val="BodyText"/>
+    <w:uiPriority w:val="9"/>
+    <w:unhideWhenUsed/>
+    <w:qFormat/>
+    <w:rsid w:val="0035689B"/>
+    <w:pPr>
+      <w:keepNext/>
+      <w:keepLines/>
+      <w:spacing w:before="200" w:after="0"/>
+      <w:outlineLvl w:val="1"/>
     </w:pPr>
     <w:rPr>
       <w:rFonts w:eastAsiaTheme="majorEastAsia" w:cs="Times New Roman (Headings CS)"/>
@@ -771,42 +798,17 @@
       <w:bCs/>
       <w:smallCaps/>
       <w:color w:val="000000" w:themeColor="text1"/>
-      <w:sz w:val="32"/>
-      <w:szCs w:val="32"/>
-    </w:rPr>
-  </w:style>
-  <w:style w:type="paragraph" w:styleId="Heading2">
-    <w:name w:val="heading 2"/>
+      <w:szCs w:val="28"/>
+    </w:rPr>
+  </w:style>
+  <w:style w:type="paragraph" w:styleId="Heading3">
+    <w:name w:val="heading 3"/>
     <w:basedOn w:val="Normal"/>
     <w:next w:val="BodyText"/>
     <w:uiPriority w:val="9"/>
     <w:unhideWhenUsed/>
     <w:qFormat/>
-    <w:rsid w:val="003B129B"/>
-    <w:pPr>
-      <w:keepNext/>
-      <w:keepLines/>
-      <w:spacing w:before="200" w:after="0"/>
-      <w:outlineLvl w:val="1"/>
-    </w:pPr>
-    <w:rPr>
-      <w:rFonts w:eastAsiaTheme="majorEastAsia" w:cs="Times New Roman (Headings CS)"/>
-      <w:b/>
-      <w:bCs/>
-      <w:smallCaps/>
-      <w:color w:val="000000" w:themeColor="text1"/>
-      <w:sz w:val="28"/>
-      <w:szCs w:val="28"/>
-    </w:rPr>
-  </w:style>
-  <w:style w:type="paragraph" w:styleId="Heading3">
-    <w:name w:val="heading 3"/>
-    <w:basedOn w:val="Normal"/>
-    <w:next w:val="BodyText"/>
-    <w:uiPriority w:val="9"/>
-    <w:unhideWhenUsed/>
-    <w:qFormat/>
-    <w:rsid w:val="003B129B"/>
+    <w:rsid w:val="0035689B"/>
     <w:pPr>
       <w:keepNext/>
       <w:keepLines/>

</xml_diff>

<commit_message>
Normalize CV.md headings and restructure sections
Adjust CV markdown for consistent heading levels and capitalization, reorganize Professional Experience (add Special Master and Court/Legislative Consultant sections), and tidy course/teaching/publication section headings. Also add a commented terminal cd command in the header snippet. Regenerated PDF and reference DOCX binaries updated.
</commit_message>
<xml_diff>
--- a/reference.docx
+++ b/reference.docx
@@ -48,10 +48,7 @@
       </w:pPr>
       <w:bookmarkStart w:id="0" w:name="heading-1"/>
       <w:r>
-        <w:t xml:space="preserve"> </w:t>
-      </w:r>
-      <w:r>
-        <w:t xml:space="preserve">Heading 1 </w:t>
+        <w:t xml:space="preserve"> Heading 1 </w:t>
       </w:r>
       <w:bookmarkEnd w:id="0"/>
     </w:p>
@@ -761,7 +758,7 @@
     <w:next w:val="BodyText"/>
     <w:uiPriority w:val="9"/>
     <w:qFormat/>
-    <w:rsid w:val="0035689B"/>
+    <w:rsid w:val="001C741B"/>
     <w:pPr>
       <w:keepNext/>
       <w:keepLines/>
@@ -785,7 +782,7 @@
     <w:uiPriority w:val="9"/>
     <w:unhideWhenUsed/>
     <w:qFormat/>
-    <w:rsid w:val="0035689B"/>
+    <w:rsid w:val="00117E3D"/>
     <w:pPr>
       <w:keepNext/>
       <w:keepLines/>
@@ -798,6 +795,8 @@
       <w:bCs/>
       <w:smallCaps/>
       <w:color w:val="000000" w:themeColor="text1"/>
+      <w:spacing w:val="-10"/>
+      <w:sz w:val="26"/>
       <w:szCs w:val="28"/>
     </w:rPr>
   </w:style>

</xml_diff>